<commit_message>
fix: fix consultant review, fix dashes
</commit_message>
<xml_diff>
--- a/Отзыв консультанта об учебной практике.docx
+++ b/Отзыв консультанта об учебной практике.docx
@@ -1,6 +1,6 @@
 
 <file path=word/document.xml><?xml version="1.0" encoding="utf-8"?>
-<w:document xmlns:o="urn:schemas-microsoft-com:office:office" xmlns:r="http://schemas.openxmlformats.org/officeDocument/2006/relationships" xmlns:v="urn:schemas-microsoft-com:vml" xmlns:w="http://schemas.openxmlformats.org/wordprocessingml/2006/main" xmlns:w10="urn:schemas-microsoft-com:office:word" xmlns:wp="http://schemas.openxmlformats.org/drawingml/2006/wordprocessingDrawing" xmlns:wps="http://schemas.microsoft.com/office/word/2010/wordprocessingShape" xmlns:wpg="http://schemas.microsoft.com/office/word/2010/wordprocessingGroup" xmlns:mc="http://schemas.openxmlformats.org/markup-compatibility/2006" xmlns:wp14="http://schemas.microsoft.com/office/word/2010/wordprocessingDrawing" xmlns:w14="http://schemas.microsoft.com/office/word/2010/wordml" xmlns:w15="http://schemas.microsoft.com/office/word/2012/wordml" mc:Ignorable="w14 wp14 w15">
+<w:document xmlns:o="urn:schemas-microsoft-com:office:office" xmlns:r="http://schemas.openxmlformats.org/officeDocument/2006/relationships" xmlns:v="urn:schemas-microsoft-com:vml" xmlns:w="http://schemas.openxmlformats.org/wordprocessingml/2006/main" xmlns:w10="urn:schemas-microsoft-com:office:word" xmlns:wp="http://schemas.openxmlformats.org/drawingml/2006/wordprocessingDrawing" xmlns:pic="http://schemas.openxmlformats.org/drawingml/2006/picture" xmlns:wps="http://schemas.microsoft.com/office/word/2010/wordprocessingShape" xmlns:wpg="http://schemas.microsoft.com/office/word/2010/wordprocessingGroup" xmlns:mc="http://schemas.openxmlformats.org/markup-compatibility/2006" xmlns:wp14="http://schemas.microsoft.com/office/word/2010/wordprocessingDrawing" xmlns:w14="http://schemas.microsoft.com/office/word/2010/wordml" xmlns:w15="http://schemas.microsoft.com/office/word/2012/wordml" mc:Ignorable="w14 wp14 w15">
   <w:body>
     <w:p>
       <w:pPr>
@@ -124,7 +124,7 @@
           <w:lang w:eastAsia="ru-RU"/>
           <w14:ligatures w14:val="none"/>
         </w:rPr>
-        <w:t>Оцените по шкале от 1 до 5 следующие утверждения (1 - совсем не согласен с утверждением, “всё абсолютно не так”; 5 - полностью согласен с утверждением, “удивительно, но именно так и есть”):</w:t>
+        <w:t>Оцените по шкале от 1 до 5 следующие утверждения (1 — совсем не согласен с утверждением, “всё абсолютно не так”; 5 — полностью согласен с утверждением, “удивительно, но именно так и есть”):</w:t>
       </w:r>
     </w:p>
     <w:p>
@@ -134,7 +134,7 @@
           <w:ilvl w:val="0"/>
           <w:numId w:val="7"/>
         </w:numPr>
-        <w:ind w:left="709" w:hanging="709"/>
+        <w:ind w:hanging="709" w:start="709"/>
         <w:jc w:val="both"/>
         <w:rPr>
           <w:rFonts w:ascii="Times New Roman" w:hAnsi="Times New Roman" w:eastAsia="Times New Roman" w:cs="Times New Roman"/>
@@ -157,7 +157,7 @@
     <w:p>
       <w:pPr>
         <w:pStyle w:val="Normal"/>
-        <w:ind w:left="720" w:hanging="0"/>
+        <w:ind w:hanging="0" w:start="720"/>
         <w:jc w:val="both"/>
         <w:rPr>
           <w:rFonts w:ascii="Times New Roman" w:hAnsi="Times New Roman" w:eastAsia="Times New Roman" w:cs="Times New Roman"/>
@@ -220,7 +220,7 @@
     <w:p>
       <w:pPr>
         <w:pStyle w:val="Normal"/>
-        <w:ind w:left="720" w:hanging="0"/>
+        <w:ind w:hanging="0" w:start="720"/>
         <w:jc w:val="both"/>
         <w:rPr>
           <w:rFonts w:ascii="Times New Roman" w:hAnsi="Times New Roman" w:eastAsia="Times New Roman" w:cs="Times New Roman"/>
@@ -277,13 +277,33 @@
           <w:lang w:eastAsia="ru-RU"/>
           <w14:ligatures w14:val="none"/>
         </w:rPr>
-        <w:t>Отчётность была регулярной, коммуникации с научным руководителем были не реже раза в неделю:</w:t>
+        <w:t xml:space="preserve">Отчётность была регулярной, коммуникации с </w:t>
+      </w:r>
+      <w:r>
+        <w:rPr>
+          <w:rFonts w:eastAsia="Times New Roman" w:cs="Times New Roman" w:ascii="Times New Roman" w:hAnsi="Times New Roman"/>
+          <w:color w:val="000000"/>
+          <w:kern w:val="0"/>
+          <w:lang w:eastAsia="ru-RU"/>
+          <w14:ligatures w14:val="none"/>
+        </w:rPr>
+        <w:t>консультантом</w:t>
+      </w:r>
+      <w:r>
+        <w:rPr>
+          <w:rFonts w:eastAsia="Times New Roman" w:cs="Times New Roman" w:ascii="Times New Roman" w:hAnsi="Times New Roman"/>
+          <w:color w:val="000000"/>
+          <w:kern w:val="0"/>
+          <w:lang w:eastAsia="ru-RU"/>
+          <w14:ligatures w14:val="none"/>
+        </w:rPr>
+        <w:t xml:space="preserve"> были не реже раза в неделю:</w:t>
       </w:r>
     </w:p>
     <w:p>
       <w:pPr>
         <w:pStyle w:val="Normal"/>
-        <w:ind w:left="720" w:hanging="0"/>
+        <w:ind w:hanging="0" w:start="720"/>
         <w:jc w:val="both"/>
         <w:rPr>
           <w:rFonts w:ascii="Times New Roman" w:hAnsi="Times New Roman" w:eastAsia="Times New Roman" w:cs="Times New Roman"/>
@@ -345,7 +365,7 @@
       <w:r>
         <w:rPr>
           <w:rFonts w:eastAsia="Times New Roman" w:cs="Times New Roman" w:ascii="Times New Roman" w:hAnsi="Times New Roman"/>
-          <w:color w:val="000000" w:themeColor="text1"/>
+          <w:color w:themeColor="text1" w:val="000000"/>
           <w:kern w:val="0"/>
           <w:lang w:eastAsia="ru-RU"/>
           <w14:ligatures w14:val="none"/>
@@ -356,7 +376,7 @@
     <w:p>
       <w:pPr>
         <w:pStyle w:val="Normal"/>
-        <w:ind w:left="720" w:hanging="0"/>
+        <w:ind w:hanging="0" w:start="720"/>
         <w:jc w:val="both"/>
         <w:rPr>
           <w:rFonts w:ascii="Times New Roman" w:hAnsi="Times New Roman" w:eastAsia="Times New Roman" w:cs="Times New Roman"/>
@@ -493,7 +513,7 @@
     <w:p>
       <w:pPr>
         <w:pStyle w:val="Normal"/>
-        <w:ind w:left="720" w:hanging="0"/>
+        <w:ind w:hanging="0" w:start="720"/>
         <w:jc w:val="both"/>
         <w:rPr>
           <w:rFonts w:ascii="Times New Roman" w:hAnsi="Times New Roman" w:eastAsia="Times New Roman" w:cs="Times New Roman"/>
@@ -570,7 +590,7 @@
     <w:p>
       <w:pPr>
         <w:pStyle w:val="Normal"/>
-        <w:ind w:left="720" w:hanging="0"/>
+        <w:ind w:hanging="0" w:start="720"/>
         <w:jc w:val="both"/>
         <w:rPr>
           <w:rFonts w:ascii="Times New Roman" w:hAnsi="Times New Roman" w:eastAsia="Times New Roman" w:cs="Times New Roman"/>
@@ -603,7 +623,7 @@
     <w:p>
       <w:pPr>
         <w:pStyle w:val="Normal"/>
-        <w:ind w:left="720" w:hanging="0"/>
+        <w:ind w:hanging="0" w:start="720"/>
         <w:jc w:val="both"/>
         <w:rPr>
           <w:rFonts w:ascii="Times New Roman" w:hAnsi="Times New Roman" w:eastAsia="Times New Roman" w:cs="Times New Roman"/>
@@ -636,7 +656,7 @@
     <w:p>
       <w:pPr>
         <w:pStyle w:val="Normal"/>
-        <w:ind w:left="720" w:hanging="0"/>
+        <w:ind w:hanging="0" w:start="720"/>
         <w:jc w:val="both"/>
         <w:rPr>
           <w:rFonts w:ascii="Times New Roman" w:hAnsi="Times New Roman" w:eastAsia="Times New Roman" w:cs="Times New Roman"/>
@@ -711,7 +731,7 @@
     <w:p>
       <w:pPr>
         <w:pStyle w:val="Normal"/>
-        <w:ind w:left="720" w:hanging="0"/>
+        <w:ind w:hanging="0" w:start="720"/>
         <w:jc w:val="both"/>
         <w:rPr>
           <w:rFonts w:ascii="Times New Roman" w:hAnsi="Times New Roman" w:eastAsia="Times New Roman" w:cs="Times New Roman"/>
@@ -744,7 +764,7 @@
     <w:p>
       <w:pPr>
         <w:pStyle w:val="Normal"/>
-        <w:ind w:left="720" w:hanging="0"/>
+        <w:ind w:hanging="0" w:start="720"/>
         <w:jc w:val="both"/>
         <w:rPr>
           <w:rFonts w:ascii="Times New Roman" w:hAnsi="Times New Roman" w:eastAsia="Times New Roman" w:cs="Times New Roman"/>
@@ -777,7 +797,7 @@
     <w:p>
       <w:pPr>
         <w:pStyle w:val="Normal"/>
-        <w:ind w:left="720" w:hanging="0"/>
+        <w:ind w:hanging="0" w:start="720"/>
         <w:jc w:val="both"/>
         <w:rPr>
           <w:rFonts w:ascii="Times New Roman" w:hAnsi="Times New Roman" w:eastAsia="Times New Roman" w:cs="Times New Roman"/>
@@ -846,30 +866,30 @@
           <w:lang w:eastAsia="ru-RU"/>
           <w14:ligatures w14:val="none"/>
         </w:rPr>
-        <w:t>Итого рекомендуемая оценка: (заполнить конкретной буквой: A, B, C, D, E, F), где А – “полностью доволен”, “отлично”; F – “ужасно”, “неудовлетворительно”, “всё с самого начала переделать”.</w:t>
+        <w:t>Итого рекомендуемая оценка: (заполнить конкретной буквой: A, B, C, D, E, F), где А — “полностью доволен”, “отлично”; F — “ужасно”, “неудовлетворительно”, “всё с самого начала переделать”.</w:t>
       </w:r>
     </w:p>
     <w:tbl>
       <w:tblPr>
         <w:tblW w:w="9351" w:type="dxa"/>
-        <w:jc w:val="left"/>
+        <w:jc w:val="start"/>
         <w:tblInd w:w="0" w:type="dxa"/>
         <w:tblLayout w:type="fixed"/>
         <w:tblCellMar>
           <w:top w:w="100" w:type="dxa"/>
-          <w:left w:w="120" w:type="dxa"/>
+          <w:start w:w="120" w:type="dxa"/>
           <w:bottom w:w="100" w:type="dxa"/>
-          <w:right w:w="120" w:type="dxa"/>
+          <w:end w:w="120" w:type="dxa"/>
         </w:tblCellMar>
-        <w:tblLook w:val="04a0" w:noHBand="0" w:noVBand="1" w:firstColumn="1" w:lastRow="0" w:lastColumn="0" w:firstRow="1"/>
+        <w:tblLook w:firstRow="1" w:noVBand="1" w:lastRow="0" w:firstColumn="1" w:lastColumn="0" w:noHBand="0" w:val="04a0"/>
       </w:tblPr>
       <w:tblGrid>
         <w:gridCol w:w="4814"/>
-        <w:gridCol w:w="4536"/>
+        <w:gridCol w:w="4537"/>
       </w:tblGrid>
       <w:tr>
         <w:trPr>
-          <w:trHeight w:val="870" w:hRule="atLeast"/>
+          <w:trHeight w:val="623" w:hRule="atLeast"/>
         </w:trPr>
         <w:tc>
           <w:tcPr>
@@ -923,7 +943,7 @@
         </w:tc>
         <w:tc>
           <w:tcPr>
-            <w:tcW w:w="4536" w:type="dxa"/>
+            <w:tcW w:w="4537" w:type="dxa"/>
             <w:tcBorders/>
           </w:tcPr>
           <w:p>
@@ -1004,7 +1024,7 @@
         </w:tc>
         <w:tc>
           <w:tcPr>
-            <w:tcW w:w="4536" w:type="dxa"/>
+            <w:tcW w:w="4537" w:type="dxa"/>
             <w:tcBorders/>
           </w:tcPr>
           <w:p>
@@ -1052,31 +1072,7 @@
                 <w:lang w:eastAsia="ru-RU"/>
                 <w14:ligatures w14:val="none"/>
               </w:rPr>
-              <w:t>название компании (если не С</w:t>
-            </w:r>
-            <w:r>
-              <w:rPr>
-                <w:rFonts w:eastAsia="Times New Roman" w:cs="Times New Roman" w:ascii="Times New Roman" w:hAnsi="Times New Roman"/>
-                <w:b/>
-                <w:bCs/>
-                <w:color w:val="000000"/>
-                <w:kern w:val="0"/>
-                <w:lang w:eastAsia="ru-RU"/>
-                <w14:ligatures w14:val="none"/>
-              </w:rPr>
-              <w:t>Пб</w:t>
-            </w:r>
-            <w:r>
-              <w:rPr>
-                <w:rFonts w:eastAsia="Times New Roman" w:cs="Times New Roman" w:ascii="Times New Roman" w:hAnsi="Times New Roman"/>
-                <w:b/>
-                <w:bCs/>
-                <w:color w:val="000000"/>
-                <w:kern w:val="0"/>
-                <w:lang w:eastAsia="ru-RU"/>
-                <w14:ligatures w14:val="none"/>
-              </w:rPr>
-              <w:t>ГУ),</w:t>
+              <w:t>название компании (если не СПбГУ),</w:t>
             </w:r>
           </w:p>
           <w:p>
@@ -1197,12 +1193,12 @@
       <w:start w:val="1"/>
       <w:numFmt w:val="decimal"/>
       <w:lvlText w:val="%1."/>
-      <w:lvlJc w:val="left"/>
+      <w:lvlJc w:val="start"/>
       <w:pPr>
         <w:tabs>
           <w:tab w:val="num" w:pos="0"/>
         </w:tabs>
-        <w:ind w:left="1080" w:hanging="360"/>
+        <w:ind w:start="1080" w:hanging="360"/>
       </w:pPr>
       <w:rPr/>
     </w:lvl>
@@ -1210,12 +1206,12 @@
       <w:start w:val="1"/>
       <w:numFmt w:val="lowerLetter"/>
       <w:lvlText w:val="%2."/>
-      <w:lvlJc w:val="left"/>
+      <w:lvlJc w:val="start"/>
       <w:pPr>
         <w:tabs>
           <w:tab w:val="num" w:pos="0"/>
         </w:tabs>
-        <w:ind w:left="1800" w:hanging="360"/>
+        <w:ind w:start="1800" w:hanging="360"/>
       </w:pPr>
       <w:rPr/>
     </w:lvl>
@@ -1223,12 +1219,12 @@
       <w:start w:val="1"/>
       <w:numFmt w:val="lowerRoman"/>
       <w:lvlText w:val="%3."/>
-      <w:lvlJc w:val="right"/>
+      <w:lvlJc w:val="end"/>
       <w:pPr>
         <w:tabs>
           <w:tab w:val="num" w:pos="0"/>
         </w:tabs>
-        <w:ind w:left="2520" w:hanging="180"/>
+        <w:ind w:start="2520" w:hanging="180"/>
       </w:pPr>
       <w:rPr/>
     </w:lvl>
@@ -1236,12 +1232,12 @@
       <w:start w:val="1"/>
       <w:numFmt w:val="decimal"/>
       <w:lvlText w:val="%4."/>
-      <w:lvlJc w:val="left"/>
+      <w:lvlJc w:val="start"/>
       <w:pPr>
         <w:tabs>
           <w:tab w:val="num" w:pos="0"/>
         </w:tabs>
-        <w:ind w:left="3240" w:hanging="360"/>
+        <w:ind w:start="3240" w:hanging="360"/>
       </w:pPr>
       <w:rPr/>
     </w:lvl>
@@ -1249,12 +1245,12 @@
       <w:start w:val="1"/>
       <w:numFmt w:val="lowerLetter"/>
       <w:lvlText w:val="%5."/>
-      <w:lvlJc w:val="left"/>
+      <w:lvlJc w:val="start"/>
       <w:pPr>
         <w:tabs>
           <w:tab w:val="num" w:pos="0"/>
         </w:tabs>
-        <w:ind w:left="3960" w:hanging="360"/>
+        <w:ind w:start="3960" w:hanging="360"/>
       </w:pPr>
       <w:rPr/>
     </w:lvl>
@@ -1262,12 +1258,12 @@
       <w:start w:val="1"/>
       <w:numFmt w:val="lowerRoman"/>
       <w:lvlText w:val="%6."/>
-      <w:lvlJc w:val="right"/>
+      <w:lvlJc w:val="end"/>
       <w:pPr>
         <w:tabs>
           <w:tab w:val="num" w:pos="0"/>
         </w:tabs>
-        <w:ind w:left="4680" w:hanging="180"/>
+        <w:ind w:start="4680" w:hanging="180"/>
       </w:pPr>
       <w:rPr/>
     </w:lvl>
@@ -1275,12 +1271,12 @@
       <w:start w:val="1"/>
       <w:numFmt w:val="decimal"/>
       <w:lvlText w:val="%7."/>
-      <w:lvlJc w:val="left"/>
+      <w:lvlJc w:val="start"/>
       <w:pPr>
         <w:tabs>
           <w:tab w:val="num" w:pos="0"/>
         </w:tabs>
-        <w:ind w:left="5400" w:hanging="360"/>
+        <w:ind w:start="5400" w:hanging="360"/>
       </w:pPr>
       <w:rPr/>
     </w:lvl>
@@ -1288,12 +1284,12 @@
       <w:start w:val="1"/>
       <w:numFmt w:val="lowerLetter"/>
       <w:lvlText w:val="%8."/>
-      <w:lvlJc w:val="left"/>
+      <w:lvlJc w:val="start"/>
       <w:pPr>
         <w:tabs>
           <w:tab w:val="num" w:pos="0"/>
         </w:tabs>
-        <w:ind w:left="6120" w:hanging="360"/>
+        <w:ind w:start="6120" w:hanging="360"/>
       </w:pPr>
       <w:rPr/>
     </w:lvl>
@@ -1301,12 +1297,12 @@
       <w:start w:val="1"/>
       <w:numFmt w:val="lowerRoman"/>
       <w:lvlText w:val="%9."/>
-      <w:lvlJc w:val="right"/>
+      <w:lvlJc w:val="end"/>
       <w:pPr>
         <w:tabs>
           <w:tab w:val="num" w:pos="0"/>
         </w:tabs>
-        <w:ind w:left="6840" w:hanging="180"/>
+        <w:ind w:start="6840" w:hanging="180"/>
       </w:pPr>
       <w:rPr/>
     </w:lvl>
@@ -1316,12 +1312,12 @@
       <w:start w:val="2"/>
       <w:numFmt w:val="decimal"/>
       <w:lvlText w:val="%1."/>
-      <w:lvlJc w:val="left"/>
+      <w:lvlJc w:val="start"/>
       <w:pPr>
         <w:tabs>
           <w:tab w:val="num" w:pos="720"/>
         </w:tabs>
-        <w:ind w:left="720" w:hanging="360"/>
+        <w:ind w:start="720" w:hanging="360"/>
       </w:pPr>
       <w:rPr/>
     </w:lvl>
@@ -1329,12 +1325,12 @@
       <w:start w:val="1"/>
       <w:numFmt w:val="decimal"/>
       <w:lvlText w:val="%2."/>
-      <w:lvlJc w:val="left"/>
+      <w:lvlJc w:val="start"/>
       <w:pPr>
         <w:tabs>
           <w:tab w:val="num" w:pos="1440"/>
         </w:tabs>
-        <w:ind w:left="1440" w:hanging="360"/>
+        <w:ind w:start="1440" w:hanging="360"/>
       </w:pPr>
       <w:rPr/>
     </w:lvl>
@@ -1342,12 +1338,12 @@
       <w:start w:val="1"/>
       <w:numFmt w:val="decimal"/>
       <w:lvlText w:val="%3."/>
-      <w:lvlJc w:val="left"/>
+      <w:lvlJc w:val="start"/>
       <w:pPr>
         <w:tabs>
           <w:tab w:val="num" w:pos="2160"/>
         </w:tabs>
-        <w:ind w:left="2160" w:hanging="360"/>
+        <w:ind w:start="2160" w:hanging="360"/>
       </w:pPr>
       <w:rPr/>
     </w:lvl>
@@ -1355,12 +1351,12 @@
       <w:start w:val="1"/>
       <w:numFmt w:val="decimal"/>
       <w:lvlText w:val="%4."/>
-      <w:lvlJc w:val="left"/>
+      <w:lvlJc w:val="start"/>
       <w:pPr>
         <w:tabs>
           <w:tab w:val="num" w:pos="2880"/>
         </w:tabs>
-        <w:ind w:left="2880" w:hanging="360"/>
+        <w:ind w:start="2880" w:hanging="360"/>
       </w:pPr>
       <w:rPr/>
     </w:lvl>
@@ -1368,12 +1364,12 @@
       <w:start w:val="1"/>
       <w:numFmt w:val="decimal"/>
       <w:lvlText w:val="%5."/>
-      <w:lvlJc w:val="left"/>
+      <w:lvlJc w:val="start"/>
       <w:pPr>
         <w:tabs>
           <w:tab w:val="num" w:pos="3600"/>
         </w:tabs>
-        <w:ind w:left="3600" w:hanging="360"/>
+        <w:ind w:start="3600" w:hanging="360"/>
       </w:pPr>
       <w:rPr/>
     </w:lvl>
@@ -1381,12 +1377,12 @@
       <w:start w:val="1"/>
       <w:numFmt w:val="decimal"/>
       <w:lvlText w:val="%6."/>
-      <w:lvlJc w:val="left"/>
+      <w:lvlJc w:val="start"/>
       <w:pPr>
         <w:tabs>
           <w:tab w:val="num" w:pos="4320"/>
         </w:tabs>
-        <w:ind w:left="4320" w:hanging="360"/>
+        <w:ind w:start="4320" w:hanging="360"/>
       </w:pPr>
       <w:rPr/>
     </w:lvl>
@@ -1394,12 +1390,12 @@
       <w:start w:val="1"/>
       <w:numFmt w:val="decimal"/>
       <w:lvlText w:val="%7."/>
-      <w:lvlJc w:val="left"/>
+      <w:lvlJc w:val="start"/>
       <w:pPr>
         <w:tabs>
           <w:tab w:val="num" w:pos="5040"/>
         </w:tabs>
-        <w:ind w:left="5040" w:hanging="360"/>
+        <w:ind w:start="5040" w:hanging="360"/>
       </w:pPr>
       <w:rPr/>
     </w:lvl>
@@ -1407,12 +1403,12 @@
       <w:start w:val="1"/>
       <w:numFmt w:val="decimal"/>
       <w:lvlText w:val="%8."/>
-      <w:lvlJc w:val="left"/>
+      <w:lvlJc w:val="start"/>
       <w:pPr>
         <w:tabs>
           <w:tab w:val="num" w:pos="5760"/>
         </w:tabs>
-        <w:ind w:left="5760" w:hanging="360"/>
+        <w:ind w:start="5760" w:hanging="360"/>
       </w:pPr>
       <w:rPr/>
     </w:lvl>
@@ -1420,12 +1416,12 @@
       <w:start w:val="1"/>
       <w:numFmt w:val="decimal"/>
       <w:lvlText w:val="%9."/>
-      <w:lvlJc w:val="left"/>
+      <w:lvlJc w:val="start"/>
       <w:pPr>
         <w:tabs>
           <w:tab w:val="num" w:pos="6480"/>
         </w:tabs>
-        <w:ind w:left="6480" w:hanging="360"/>
+        <w:ind w:start="6480" w:hanging="360"/>
       </w:pPr>
       <w:rPr/>
     </w:lvl>
@@ -1435,12 +1431,12 @@
       <w:start w:val="3"/>
       <w:numFmt w:val="decimal"/>
       <w:lvlText w:val="%1."/>
-      <w:lvlJc w:val="left"/>
+      <w:lvlJc w:val="start"/>
       <w:pPr>
         <w:tabs>
           <w:tab w:val="num" w:pos="720"/>
         </w:tabs>
-        <w:ind w:left="720" w:hanging="360"/>
+        <w:ind w:start="720" w:hanging="360"/>
       </w:pPr>
       <w:rPr/>
     </w:lvl>
@@ -1448,12 +1444,12 @@
       <w:start w:val="1"/>
       <w:numFmt w:val="decimal"/>
       <w:lvlText w:val="%2."/>
-      <w:lvlJc w:val="left"/>
+      <w:lvlJc w:val="start"/>
       <w:pPr>
         <w:tabs>
           <w:tab w:val="num" w:pos="1440"/>
         </w:tabs>
-        <w:ind w:left="1440" w:hanging="360"/>
+        <w:ind w:start="1440" w:hanging="360"/>
       </w:pPr>
       <w:rPr/>
     </w:lvl>
@@ -1461,12 +1457,12 @@
       <w:start w:val="1"/>
       <w:numFmt w:val="decimal"/>
       <w:lvlText w:val="%3."/>
-      <w:lvlJc w:val="left"/>
+      <w:lvlJc w:val="start"/>
       <w:pPr>
         <w:tabs>
           <w:tab w:val="num" w:pos="2160"/>
         </w:tabs>
-        <w:ind w:left="2160" w:hanging="360"/>
+        <w:ind w:start="2160" w:hanging="360"/>
       </w:pPr>
       <w:rPr/>
     </w:lvl>
@@ -1474,12 +1470,12 @@
       <w:start w:val="1"/>
       <w:numFmt w:val="decimal"/>
       <w:lvlText w:val="%4."/>
-      <w:lvlJc w:val="left"/>
+      <w:lvlJc w:val="start"/>
       <w:pPr>
         <w:tabs>
           <w:tab w:val="num" w:pos="2880"/>
         </w:tabs>
-        <w:ind w:left="2880" w:hanging="360"/>
+        <w:ind w:start="2880" w:hanging="360"/>
       </w:pPr>
       <w:rPr/>
     </w:lvl>
@@ -1487,12 +1483,12 @@
       <w:start w:val="1"/>
       <w:numFmt w:val="decimal"/>
       <w:lvlText w:val="%5."/>
-      <w:lvlJc w:val="left"/>
+      <w:lvlJc w:val="start"/>
       <w:pPr>
         <w:tabs>
           <w:tab w:val="num" w:pos="3600"/>
         </w:tabs>
-        <w:ind w:left="3600" w:hanging="360"/>
+        <w:ind w:start="3600" w:hanging="360"/>
       </w:pPr>
       <w:rPr/>
     </w:lvl>
@@ -1500,12 +1496,12 @@
       <w:start w:val="1"/>
       <w:numFmt w:val="decimal"/>
       <w:lvlText w:val="%6."/>
-      <w:lvlJc w:val="left"/>
+      <w:lvlJc w:val="start"/>
       <w:pPr>
         <w:tabs>
           <w:tab w:val="num" w:pos="4320"/>
         </w:tabs>
-        <w:ind w:left="4320" w:hanging="360"/>
+        <w:ind w:start="4320" w:hanging="360"/>
       </w:pPr>
       <w:rPr/>
     </w:lvl>
@@ -1513,12 +1509,12 @@
       <w:start w:val="1"/>
       <w:numFmt w:val="decimal"/>
       <w:lvlText w:val="%7."/>
-      <w:lvlJc w:val="left"/>
+      <w:lvlJc w:val="start"/>
       <w:pPr>
         <w:tabs>
           <w:tab w:val="num" w:pos="5040"/>
         </w:tabs>
-        <w:ind w:left="5040" w:hanging="360"/>
+        <w:ind w:start="5040" w:hanging="360"/>
       </w:pPr>
       <w:rPr/>
     </w:lvl>
@@ -1526,12 +1522,12 @@
       <w:start w:val="1"/>
       <w:numFmt w:val="decimal"/>
       <w:lvlText w:val="%8."/>
-      <w:lvlJc w:val="left"/>
+      <w:lvlJc w:val="start"/>
       <w:pPr>
         <w:tabs>
           <w:tab w:val="num" w:pos="5760"/>
         </w:tabs>
-        <w:ind w:left="5760" w:hanging="360"/>
+        <w:ind w:start="5760" w:hanging="360"/>
       </w:pPr>
       <w:rPr/>
     </w:lvl>
@@ -1539,12 +1535,12 @@
       <w:start w:val="1"/>
       <w:numFmt w:val="decimal"/>
       <w:lvlText w:val="%9."/>
-      <w:lvlJc w:val="left"/>
+      <w:lvlJc w:val="start"/>
       <w:pPr>
         <w:tabs>
           <w:tab w:val="num" w:pos="6480"/>
         </w:tabs>
-        <w:ind w:left="6480" w:hanging="360"/>
+        <w:ind w:start="6480" w:hanging="360"/>
       </w:pPr>
       <w:rPr/>
     </w:lvl>
@@ -1554,12 +1550,12 @@
       <w:start w:val="4"/>
       <w:numFmt w:val="decimal"/>
       <w:lvlText w:val="%1."/>
-      <w:lvlJc w:val="left"/>
+      <w:lvlJc w:val="start"/>
       <w:pPr>
         <w:tabs>
           <w:tab w:val="num" w:pos="720"/>
         </w:tabs>
-        <w:ind w:left="720" w:hanging="360"/>
+        <w:ind w:start="720" w:hanging="360"/>
       </w:pPr>
       <w:rPr/>
     </w:lvl>
@@ -1567,12 +1563,12 @@
       <w:start w:val="1"/>
       <w:numFmt w:val="decimal"/>
       <w:lvlText w:val="%2."/>
-      <w:lvlJc w:val="left"/>
+      <w:lvlJc w:val="start"/>
       <w:pPr>
         <w:tabs>
           <w:tab w:val="num" w:pos="1440"/>
         </w:tabs>
-        <w:ind w:left="1440" w:hanging="360"/>
+        <w:ind w:start="1440" w:hanging="360"/>
       </w:pPr>
       <w:rPr/>
     </w:lvl>
@@ -1580,12 +1576,12 @@
       <w:start w:val="1"/>
       <w:numFmt w:val="decimal"/>
       <w:lvlText w:val="%3."/>
-      <w:lvlJc w:val="left"/>
+      <w:lvlJc w:val="start"/>
       <w:pPr>
         <w:tabs>
           <w:tab w:val="num" w:pos="2160"/>
         </w:tabs>
-        <w:ind w:left="2160" w:hanging="360"/>
+        <w:ind w:start="2160" w:hanging="360"/>
       </w:pPr>
       <w:rPr/>
     </w:lvl>
@@ -1593,12 +1589,12 @@
       <w:start w:val="1"/>
       <w:numFmt w:val="decimal"/>
       <w:lvlText w:val="%4."/>
-      <w:lvlJc w:val="left"/>
+      <w:lvlJc w:val="start"/>
       <w:pPr>
         <w:tabs>
           <w:tab w:val="num" w:pos="2880"/>
         </w:tabs>
-        <w:ind w:left="2880" w:hanging="360"/>
+        <w:ind w:start="2880" w:hanging="360"/>
       </w:pPr>
       <w:rPr/>
     </w:lvl>
@@ -1606,12 +1602,12 @@
       <w:start w:val="1"/>
       <w:numFmt w:val="decimal"/>
       <w:lvlText w:val="%5."/>
-      <w:lvlJc w:val="left"/>
+      <w:lvlJc w:val="start"/>
       <w:pPr>
         <w:tabs>
           <w:tab w:val="num" w:pos="3600"/>
         </w:tabs>
-        <w:ind w:left="3600" w:hanging="360"/>
+        <w:ind w:start="3600" w:hanging="360"/>
       </w:pPr>
       <w:rPr/>
     </w:lvl>
@@ -1619,12 +1615,12 @@
       <w:start w:val="1"/>
       <w:numFmt w:val="decimal"/>
       <w:lvlText w:val="%6."/>
-      <w:lvlJc w:val="left"/>
+      <w:lvlJc w:val="start"/>
       <w:pPr>
         <w:tabs>
           <w:tab w:val="num" w:pos="4320"/>
         </w:tabs>
-        <w:ind w:left="4320" w:hanging="360"/>
+        <w:ind w:start="4320" w:hanging="360"/>
       </w:pPr>
       <w:rPr/>
     </w:lvl>
@@ -1632,12 +1628,12 @@
       <w:start w:val="1"/>
       <w:numFmt w:val="decimal"/>
       <w:lvlText w:val="%7."/>
-      <w:lvlJc w:val="left"/>
+      <w:lvlJc w:val="start"/>
       <w:pPr>
         <w:tabs>
           <w:tab w:val="num" w:pos="5040"/>
         </w:tabs>
-        <w:ind w:left="5040" w:hanging="360"/>
+        <w:ind w:start="5040" w:hanging="360"/>
       </w:pPr>
       <w:rPr/>
     </w:lvl>
@@ -1645,12 +1641,12 @@
       <w:start w:val="1"/>
       <w:numFmt w:val="decimal"/>
       <w:lvlText w:val="%8."/>
-      <w:lvlJc w:val="left"/>
+      <w:lvlJc w:val="start"/>
       <w:pPr>
         <w:tabs>
           <w:tab w:val="num" w:pos="5760"/>
         </w:tabs>
-        <w:ind w:left="5760" w:hanging="360"/>
+        <w:ind w:start="5760" w:hanging="360"/>
       </w:pPr>
       <w:rPr/>
     </w:lvl>
@@ -1658,12 +1654,12 @@
       <w:start w:val="1"/>
       <w:numFmt w:val="decimal"/>
       <w:lvlText w:val="%9."/>
-      <w:lvlJc w:val="left"/>
+      <w:lvlJc w:val="start"/>
       <w:pPr>
         <w:tabs>
           <w:tab w:val="num" w:pos="6480"/>
         </w:tabs>
-        <w:ind w:left="6480" w:hanging="360"/>
+        <w:ind w:start="6480" w:hanging="360"/>
       </w:pPr>
       <w:rPr/>
     </w:lvl>
@@ -1673,12 +1669,12 @@
       <w:start w:val="5"/>
       <w:numFmt w:val="decimal"/>
       <w:lvlText w:val="%1."/>
-      <w:lvlJc w:val="left"/>
+      <w:lvlJc w:val="start"/>
       <w:pPr>
         <w:tabs>
           <w:tab w:val="num" w:pos="720"/>
         </w:tabs>
-        <w:ind w:left="720" w:hanging="360"/>
+        <w:ind w:start="720" w:hanging="360"/>
       </w:pPr>
       <w:rPr/>
     </w:lvl>
@@ -1686,12 +1682,12 @@
       <w:start w:val="1"/>
       <w:numFmt w:val="decimal"/>
       <w:lvlText w:val="%2."/>
-      <w:lvlJc w:val="left"/>
+      <w:lvlJc w:val="start"/>
       <w:pPr>
         <w:tabs>
           <w:tab w:val="num" w:pos="1440"/>
         </w:tabs>
-        <w:ind w:left="1440" w:hanging="360"/>
+        <w:ind w:start="1440" w:hanging="360"/>
       </w:pPr>
       <w:rPr/>
     </w:lvl>
@@ -1699,12 +1695,12 @@
       <w:start w:val="1"/>
       <w:numFmt w:val="decimal"/>
       <w:lvlText w:val="%3."/>
-      <w:lvlJc w:val="left"/>
+      <w:lvlJc w:val="start"/>
       <w:pPr>
         <w:tabs>
           <w:tab w:val="num" w:pos="2160"/>
         </w:tabs>
-        <w:ind w:left="2160" w:hanging="360"/>
+        <w:ind w:start="2160" w:hanging="360"/>
       </w:pPr>
       <w:rPr/>
     </w:lvl>
@@ -1712,12 +1708,12 @@
       <w:start w:val="1"/>
       <w:numFmt w:val="decimal"/>
       <w:lvlText w:val="%4."/>
-      <w:lvlJc w:val="left"/>
+      <w:lvlJc w:val="start"/>
       <w:pPr>
         <w:tabs>
           <w:tab w:val="num" w:pos="2880"/>
         </w:tabs>
-        <w:ind w:left="2880" w:hanging="360"/>
+        <w:ind w:start="2880" w:hanging="360"/>
       </w:pPr>
       <w:rPr/>
     </w:lvl>
@@ -1725,12 +1721,12 @@
       <w:start w:val="1"/>
       <w:numFmt w:val="decimal"/>
       <w:lvlText w:val="%5."/>
-      <w:lvlJc w:val="left"/>
+      <w:lvlJc w:val="start"/>
       <w:pPr>
         <w:tabs>
           <w:tab w:val="num" w:pos="3600"/>
         </w:tabs>
-        <w:ind w:left="3600" w:hanging="360"/>
+        <w:ind w:start="3600" w:hanging="360"/>
       </w:pPr>
       <w:rPr/>
     </w:lvl>
@@ -1738,12 +1734,12 @@
       <w:start w:val="1"/>
       <w:numFmt w:val="decimal"/>
       <w:lvlText w:val="%6."/>
-      <w:lvlJc w:val="left"/>
+      <w:lvlJc w:val="start"/>
       <w:pPr>
         <w:tabs>
           <w:tab w:val="num" w:pos="4320"/>
         </w:tabs>
-        <w:ind w:left="4320" w:hanging="360"/>
+        <w:ind w:start="4320" w:hanging="360"/>
       </w:pPr>
       <w:rPr/>
     </w:lvl>
@@ -1751,12 +1747,12 @@
       <w:start w:val="1"/>
       <w:numFmt w:val="decimal"/>
       <w:lvlText w:val="%7."/>
-      <w:lvlJc w:val="left"/>
+      <w:lvlJc w:val="start"/>
       <w:pPr>
         <w:tabs>
           <w:tab w:val="num" w:pos="5040"/>
         </w:tabs>
-        <w:ind w:left="5040" w:hanging="360"/>
+        <w:ind w:start="5040" w:hanging="360"/>
       </w:pPr>
       <w:rPr/>
     </w:lvl>
@@ -1764,12 +1760,12 @@
       <w:start w:val="1"/>
       <w:numFmt w:val="decimal"/>
       <w:lvlText w:val="%8."/>
-      <w:lvlJc w:val="left"/>
+      <w:lvlJc w:val="start"/>
       <w:pPr>
         <w:tabs>
           <w:tab w:val="num" w:pos="5760"/>
         </w:tabs>
-        <w:ind w:left="5760" w:hanging="360"/>
+        <w:ind w:start="5760" w:hanging="360"/>
       </w:pPr>
       <w:rPr/>
     </w:lvl>
@@ -1777,12 +1773,12 @@
       <w:start w:val="1"/>
       <w:numFmt w:val="decimal"/>
       <w:lvlText w:val="%9."/>
-      <w:lvlJc w:val="left"/>
+      <w:lvlJc w:val="start"/>
       <w:pPr>
         <w:tabs>
           <w:tab w:val="num" w:pos="6480"/>
         </w:tabs>
-        <w:ind w:left="6480" w:hanging="360"/>
+        <w:ind w:start="6480" w:hanging="360"/>
       </w:pPr>
       <w:rPr/>
     </w:lvl>
@@ -1792,12 +1788,12 @@
       <w:start w:val="6"/>
       <w:numFmt w:val="decimal"/>
       <w:lvlText w:val="%1."/>
-      <w:lvlJc w:val="left"/>
+      <w:lvlJc w:val="start"/>
       <w:pPr>
         <w:tabs>
           <w:tab w:val="num" w:pos="720"/>
         </w:tabs>
-        <w:ind w:left="720" w:hanging="360"/>
+        <w:ind w:start="720" w:hanging="360"/>
       </w:pPr>
       <w:rPr/>
     </w:lvl>
@@ -1805,12 +1801,12 @@
       <w:start w:val="1"/>
       <w:numFmt w:val="decimal"/>
       <w:lvlText w:val="%2."/>
-      <w:lvlJc w:val="left"/>
+      <w:lvlJc w:val="start"/>
       <w:pPr>
         <w:tabs>
           <w:tab w:val="num" w:pos="1440"/>
         </w:tabs>
-        <w:ind w:left="1440" w:hanging="360"/>
+        <w:ind w:start="1440" w:hanging="360"/>
       </w:pPr>
       <w:rPr/>
     </w:lvl>
@@ -1818,12 +1814,12 @@
       <w:start w:val="1"/>
       <w:numFmt w:val="decimal"/>
       <w:lvlText w:val="%3."/>
-      <w:lvlJc w:val="left"/>
+      <w:lvlJc w:val="start"/>
       <w:pPr>
         <w:tabs>
           <w:tab w:val="num" w:pos="2160"/>
         </w:tabs>
-        <w:ind w:left="2160" w:hanging="360"/>
+        <w:ind w:start="2160" w:hanging="360"/>
       </w:pPr>
       <w:rPr/>
     </w:lvl>
@@ -1831,12 +1827,12 @@
       <w:start w:val="1"/>
       <w:numFmt w:val="decimal"/>
       <w:lvlText w:val="%4."/>
-      <w:lvlJc w:val="left"/>
+      <w:lvlJc w:val="start"/>
       <w:pPr>
         <w:tabs>
           <w:tab w:val="num" w:pos="2880"/>
         </w:tabs>
-        <w:ind w:left="2880" w:hanging="360"/>
+        <w:ind w:start="2880" w:hanging="360"/>
       </w:pPr>
       <w:rPr/>
     </w:lvl>
@@ -1844,12 +1840,12 @@
       <w:start w:val="1"/>
       <w:numFmt w:val="decimal"/>
       <w:lvlText w:val="%5."/>
-      <w:lvlJc w:val="left"/>
+      <w:lvlJc w:val="start"/>
       <w:pPr>
         <w:tabs>
           <w:tab w:val="num" w:pos="3600"/>
         </w:tabs>
-        <w:ind w:left="3600" w:hanging="360"/>
+        <w:ind w:start="3600" w:hanging="360"/>
       </w:pPr>
       <w:rPr/>
     </w:lvl>
@@ -1857,12 +1853,12 @@
       <w:start w:val="1"/>
       <w:numFmt w:val="decimal"/>
       <w:lvlText w:val="%6."/>
-      <w:lvlJc w:val="left"/>
+      <w:lvlJc w:val="start"/>
       <w:pPr>
         <w:tabs>
           <w:tab w:val="num" w:pos="4320"/>
         </w:tabs>
-        <w:ind w:left="4320" w:hanging="360"/>
+        <w:ind w:start="4320" w:hanging="360"/>
       </w:pPr>
       <w:rPr/>
     </w:lvl>
@@ -1870,12 +1866,12 @@
       <w:start w:val="1"/>
       <w:numFmt w:val="decimal"/>
       <w:lvlText w:val="%7."/>
-      <w:lvlJc w:val="left"/>
+      <w:lvlJc w:val="start"/>
       <w:pPr>
         <w:tabs>
           <w:tab w:val="num" w:pos="5040"/>
         </w:tabs>
-        <w:ind w:left="5040" w:hanging="360"/>
+        <w:ind w:start="5040" w:hanging="360"/>
       </w:pPr>
       <w:rPr/>
     </w:lvl>
@@ -1883,12 +1879,12 @@
       <w:start w:val="1"/>
       <w:numFmt w:val="decimal"/>
       <w:lvlText w:val="%8."/>
-      <w:lvlJc w:val="left"/>
+      <w:lvlJc w:val="start"/>
       <w:pPr>
         <w:tabs>
           <w:tab w:val="num" w:pos="5760"/>
         </w:tabs>
-        <w:ind w:left="5760" w:hanging="360"/>
+        <w:ind w:start="5760" w:hanging="360"/>
       </w:pPr>
       <w:rPr/>
     </w:lvl>
@@ -1896,12 +1892,12 @@
       <w:start w:val="1"/>
       <w:numFmt w:val="decimal"/>
       <w:lvlText w:val="%9."/>
-      <w:lvlJc w:val="left"/>
+      <w:lvlJc w:val="start"/>
       <w:pPr>
         <w:tabs>
           <w:tab w:val="num" w:pos="6480"/>
         </w:tabs>
-        <w:ind w:left="6480" w:hanging="360"/>
+        <w:ind w:start="6480" w:hanging="360"/>
       </w:pPr>
       <w:rPr/>
     </w:lvl>
@@ -1911,12 +1907,12 @@
       <w:start w:val="1"/>
       <w:numFmt w:val="decimal"/>
       <w:lvlText w:val="%1."/>
-      <w:lvlJc w:val="left"/>
+      <w:lvlJc w:val="start"/>
       <w:pPr>
         <w:tabs>
           <w:tab w:val="num" w:pos="0"/>
         </w:tabs>
-        <w:ind w:left="720" w:hanging="360"/>
+        <w:ind w:start="720" w:hanging="360"/>
       </w:pPr>
       <w:rPr>
         <w:color w:val="000000"/>
@@ -1926,12 +1922,12 @@
       <w:start w:val="1"/>
       <w:numFmt w:val="lowerLetter"/>
       <w:lvlText w:val="%2."/>
-      <w:lvlJc w:val="left"/>
+      <w:lvlJc w:val="start"/>
       <w:pPr>
         <w:tabs>
           <w:tab w:val="num" w:pos="0"/>
         </w:tabs>
-        <w:ind w:left="1440" w:hanging="360"/>
+        <w:ind w:start="1440" w:hanging="360"/>
       </w:pPr>
       <w:rPr/>
     </w:lvl>
@@ -1939,12 +1935,12 @@
       <w:start w:val="1"/>
       <w:numFmt w:val="lowerRoman"/>
       <w:lvlText w:val="%3."/>
-      <w:lvlJc w:val="right"/>
+      <w:lvlJc w:val="end"/>
       <w:pPr>
         <w:tabs>
           <w:tab w:val="num" w:pos="0"/>
         </w:tabs>
-        <w:ind w:left="2160" w:hanging="180"/>
+        <w:ind w:start="2160" w:hanging="180"/>
       </w:pPr>
       <w:rPr/>
     </w:lvl>
@@ -1952,12 +1948,12 @@
       <w:start w:val="1"/>
       <w:numFmt w:val="decimal"/>
       <w:lvlText w:val="%4."/>
-      <w:lvlJc w:val="left"/>
+      <w:lvlJc w:val="start"/>
       <w:pPr>
         <w:tabs>
           <w:tab w:val="num" w:pos="0"/>
         </w:tabs>
-        <w:ind w:left="2880" w:hanging="360"/>
+        <w:ind w:start="2880" w:hanging="360"/>
       </w:pPr>
       <w:rPr/>
     </w:lvl>
@@ -1965,12 +1961,12 @@
       <w:start w:val="1"/>
       <w:numFmt w:val="lowerLetter"/>
       <w:lvlText w:val="%5."/>
-      <w:lvlJc w:val="left"/>
+      <w:lvlJc w:val="start"/>
       <w:pPr>
         <w:tabs>
           <w:tab w:val="num" w:pos="0"/>
         </w:tabs>
-        <w:ind w:left="3600" w:hanging="360"/>
+        <w:ind w:start="3600" w:hanging="360"/>
       </w:pPr>
       <w:rPr/>
     </w:lvl>
@@ -1978,12 +1974,12 @@
       <w:start w:val="1"/>
       <w:numFmt w:val="lowerRoman"/>
       <w:lvlText w:val="%6."/>
-      <w:lvlJc w:val="right"/>
+      <w:lvlJc w:val="end"/>
       <w:pPr>
         <w:tabs>
           <w:tab w:val="num" w:pos="0"/>
         </w:tabs>
-        <w:ind w:left="4320" w:hanging="180"/>
+        <w:ind w:start="4320" w:hanging="180"/>
       </w:pPr>
       <w:rPr/>
     </w:lvl>
@@ -1991,12 +1987,12 @@
       <w:start w:val="1"/>
       <w:numFmt w:val="decimal"/>
       <w:lvlText w:val="%7."/>
-      <w:lvlJc w:val="left"/>
+      <w:lvlJc w:val="start"/>
       <w:pPr>
         <w:tabs>
           <w:tab w:val="num" w:pos="0"/>
         </w:tabs>
-        <w:ind w:left="5040" w:hanging="360"/>
+        <w:ind w:start="5040" w:hanging="360"/>
       </w:pPr>
       <w:rPr/>
     </w:lvl>
@@ -2004,12 +2000,12 @@
       <w:start w:val="1"/>
       <w:numFmt w:val="lowerLetter"/>
       <w:lvlText w:val="%8."/>
-      <w:lvlJc w:val="left"/>
+      <w:lvlJc w:val="start"/>
       <w:pPr>
         <w:tabs>
           <w:tab w:val="num" w:pos="0"/>
         </w:tabs>
-        <w:ind w:left="5760" w:hanging="360"/>
+        <w:ind w:start="5760" w:hanging="360"/>
       </w:pPr>
       <w:rPr/>
     </w:lvl>
@@ -2017,12 +2013,12 @@
       <w:start w:val="1"/>
       <w:numFmt w:val="lowerRoman"/>
       <w:lvlText w:val="%9."/>
-      <w:lvlJc w:val="right"/>
+      <w:lvlJc w:val="end"/>
       <w:pPr>
         <w:tabs>
           <w:tab w:val="num" w:pos="0"/>
         </w:tabs>
-        <w:ind w:left="6480" w:hanging="180"/>
+        <w:ind w:start="6480" w:hanging="180"/>
       </w:pPr>
       <w:rPr/>
     </w:lvl>
@@ -2033,12 +2029,12 @@
       <w:numFmt w:val="none"/>
       <w:suff w:val="nothing"/>
       <w:lvlText w:val=""/>
-      <w:lvlJc w:val="left"/>
+      <w:lvlJc w:val="start"/>
       <w:pPr>
         <w:tabs>
           <w:tab w:val="num" w:pos="0"/>
         </w:tabs>
-        <w:ind w:left="0" w:hanging="0"/>
+        <w:ind w:start="0" w:hanging="0"/>
       </w:pPr>
     </w:lvl>
     <w:lvl w:ilvl="1">
@@ -2046,12 +2042,12 @@
       <w:numFmt w:val="none"/>
       <w:suff w:val="nothing"/>
       <w:lvlText w:val=""/>
-      <w:lvlJc w:val="left"/>
+      <w:lvlJc w:val="start"/>
       <w:pPr>
         <w:tabs>
           <w:tab w:val="num" w:pos="0"/>
         </w:tabs>
-        <w:ind w:left="0" w:hanging="0"/>
+        <w:ind w:start="0" w:hanging="0"/>
       </w:pPr>
     </w:lvl>
     <w:lvl w:ilvl="2">
@@ -2059,12 +2055,12 @@
       <w:numFmt w:val="none"/>
       <w:suff w:val="nothing"/>
       <w:lvlText w:val=""/>
-      <w:lvlJc w:val="left"/>
+      <w:lvlJc w:val="start"/>
       <w:pPr>
         <w:tabs>
           <w:tab w:val="num" w:pos="0"/>
         </w:tabs>
-        <w:ind w:left="0" w:hanging="0"/>
+        <w:ind w:start="0" w:hanging="0"/>
       </w:pPr>
     </w:lvl>
     <w:lvl w:ilvl="3">
@@ -2072,12 +2068,12 @@
       <w:numFmt w:val="none"/>
       <w:suff w:val="nothing"/>
       <w:lvlText w:val=""/>
-      <w:lvlJc w:val="left"/>
+      <w:lvlJc w:val="start"/>
       <w:pPr>
         <w:tabs>
           <w:tab w:val="num" w:pos="0"/>
         </w:tabs>
-        <w:ind w:left="0" w:hanging="0"/>
+        <w:ind w:start="0" w:hanging="0"/>
       </w:pPr>
     </w:lvl>
     <w:lvl w:ilvl="4">
@@ -2085,12 +2081,12 @@
       <w:numFmt w:val="none"/>
       <w:suff w:val="nothing"/>
       <w:lvlText w:val=""/>
-      <w:lvlJc w:val="left"/>
+      <w:lvlJc w:val="start"/>
       <w:pPr>
         <w:tabs>
           <w:tab w:val="num" w:pos="0"/>
         </w:tabs>
-        <w:ind w:left="0" w:hanging="0"/>
+        <w:ind w:start="0" w:hanging="0"/>
       </w:pPr>
     </w:lvl>
     <w:lvl w:ilvl="5">
@@ -2098,12 +2094,12 @@
       <w:numFmt w:val="none"/>
       <w:suff w:val="nothing"/>
       <w:lvlText w:val=""/>
-      <w:lvlJc w:val="left"/>
+      <w:lvlJc w:val="start"/>
       <w:pPr>
         <w:tabs>
           <w:tab w:val="num" w:pos="0"/>
         </w:tabs>
-        <w:ind w:left="0" w:hanging="0"/>
+        <w:ind w:start="0" w:hanging="0"/>
       </w:pPr>
     </w:lvl>
     <w:lvl w:ilvl="6">
@@ -2111,12 +2107,12 @@
       <w:numFmt w:val="none"/>
       <w:suff w:val="nothing"/>
       <w:lvlText w:val=""/>
-      <w:lvlJc w:val="left"/>
+      <w:lvlJc w:val="start"/>
       <w:pPr>
         <w:tabs>
           <w:tab w:val="num" w:pos="0"/>
         </w:tabs>
-        <w:ind w:left="0" w:hanging="0"/>
+        <w:ind w:start="0" w:hanging="0"/>
       </w:pPr>
     </w:lvl>
     <w:lvl w:ilvl="7">
@@ -2124,12 +2120,12 @@
       <w:numFmt w:val="none"/>
       <w:suff w:val="nothing"/>
       <w:lvlText w:val=""/>
-      <w:lvlJc w:val="left"/>
+      <w:lvlJc w:val="start"/>
       <w:pPr>
         <w:tabs>
           <w:tab w:val="num" w:pos="0"/>
         </w:tabs>
-        <w:ind w:left="0" w:hanging="0"/>
+        <w:ind w:start="0" w:hanging="0"/>
       </w:pPr>
     </w:lvl>
     <w:lvl w:ilvl="8">
@@ -2137,12 +2133,12 @@
       <w:numFmt w:val="none"/>
       <w:suff w:val="nothing"/>
       <w:lvlText w:val=""/>
-      <w:lvlJc w:val="left"/>
+      <w:lvlJc w:val="start"/>
       <w:pPr>
         <w:tabs>
           <w:tab w:val="num" w:pos="0"/>
         </w:tabs>
-        <w:ind w:left="0" w:hanging="0"/>
+        <w:ind w:start="0" w:hanging="0"/>
       </w:pPr>
     </w:lvl>
   </w:abstractNum>
@@ -2578,7 +2574,7 @@
       <w:suppressAutoHyphens w:val="true"/>
       <w:bidi w:val="0"/>
       <w:spacing w:before="0" w:after="0"/>
-      <w:jc w:val="left"/>
+      <w:jc w:val="start"/>
     </w:pPr>
     <w:rPr>
       <w:rFonts w:ascii="Calibri" w:hAnsi="Calibri" w:eastAsia="Calibri" w:cs="" w:asciiTheme="minorHAnsi" w:cstheme="minorBidi" w:eastAsiaTheme="minorHAnsi" w:hAnsiTheme="minorHAnsi"/>
@@ -2591,7 +2587,7 @@
     </w:rPr>
   </w:style>
   <w:style w:type="paragraph" w:styleId="Heading1">
-    <w:name w:val="Heading 1"/>
+    <w:name w:val="heading 1"/>
     <w:basedOn w:val="Normal"/>
     <w:next w:val="Normal"/>
     <w:link w:val="1"/>
@@ -2606,13 +2602,13 @@
     </w:pPr>
     <w:rPr>
       <w:rFonts w:ascii="Calibri Light" w:hAnsi="Calibri Light" w:eastAsia="" w:cs="" w:asciiTheme="majorHAnsi" w:cstheme="majorBidi" w:eastAsiaTheme="majorEastAsia" w:hAnsiTheme="majorHAnsi"/>
-      <w:color w:val="2F5496" w:themeColor="accent1" w:themeShade="bf"/>
+      <w:color w:themeColor="accent1" w:themeShade="bf" w:val="2F5496"/>
       <w:sz w:val="40"/>
       <w:szCs w:val="40"/>
     </w:rPr>
   </w:style>
   <w:style w:type="paragraph" w:styleId="Heading2">
-    <w:name w:val="Heading 2"/>
+    <w:name w:val="heading 2"/>
     <w:basedOn w:val="Normal"/>
     <w:next w:val="Normal"/>
     <w:link w:val="2"/>
@@ -2629,13 +2625,13 @@
     </w:pPr>
     <w:rPr>
       <w:rFonts w:ascii="Calibri Light" w:hAnsi="Calibri Light" w:eastAsia="" w:cs="" w:asciiTheme="majorHAnsi" w:cstheme="majorBidi" w:eastAsiaTheme="majorEastAsia" w:hAnsiTheme="majorHAnsi"/>
-      <w:color w:val="2F5496" w:themeColor="accent1" w:themeShade="bf"/>
+      <w:color w:themeColor="accent1" w:themeShade="bf" w:val="2F5496"/>
       <w:sz w:val="32"/>
       <w:szCs w:val="32"/>
     </w:rPr>
   </w:style>
   <w:style w:type="paragraph" w:styleId="Heading3">
-    <w:name w:val="Heading 3"/>
+    <w:name w:val="heading 3"/>
     <w:basedOn w:val="Normal"/>
     <w:next w:val="Normal"/>
     <w:link w:val="3"/>
@@ -2652,13 +2648,13 @@
     </w:pPr>
     <w:rPr>
       <w:rFonts w:eastAsia="" w:cs="" w:cstheme="majorBidi" w:eastAsiaTheme="majorEastAsia"/>
-      <w:color w:val="2F5496" w:themeColor="accent1" w:themeShade="bf"/>
+      <w:color w:themeColor="accent1" w:themeShade="bf" w:val="2F5496"/>
       <w:sz w:val="28"/>
       <w:szCs w:val="28"/>
     </w:rPr>
   </w:style>
   <w:style w:type="paragraph" w:styleId="Heading4">
-    <w:name w:val="Heading 4"/>
+    <w:name w:val="heading 4"/>
     <w:basedOn w:val="Normal"/>
     <w:next w:val="Normal"/>
     <w:link w:val="4"/>
@@ -2677,11 +2673,11 @@
       <w:rFonts w:eastAsia="" w:cs="" w:cstheme="majorBidi" w:eastAsiaTheme="majorEastAsia"/>
       <w:i/>
       <w:iCs/>
-      <w:color w:val="2F5496" w:themeColor="accent1" w:themeShade="bf"/>
+      <w:color w:themeColor="accent1" w:themeShade="bf" w:val="2F5496"/>
     </w:rPr>
   </w:style>
   <w:style w:type="paragraph" w:styleId="Heading5">
-    <w:name w:val="Heading 5"/>
+    <w:name w:val="heading 5"/>
     <w:basedOn w:val="Normal"/>
     <w:next w:val="Normal"/>
     <w:link w:val="5"/>
@@ -2698,11 +2694,11 @@
     </w:pPr>
     <w:rPr>
       <w:rFonts w:eastAsia="" w:cs="" w:cstheme="majorBidi" w:eastAsiaTheme="majorEastAsia"/>
-      <w:color w:val="2F5496" w:themeColor="accent1" w:themeShade="bf"/>
+      <w:color w:themeColor="accent1" w:themeShade="bf" w:val="2F5496"/>
     </w:rPr>
   </w:style>
   <w:style w:type="paragraph" w:styleId="Heading6">
-    <w:name w:val="Heading 6"/>
+    <w:name w:val="heading 6"/>
     <w:basedOn w:val="Normal"/>
     <w:next w:val="Normal"/>
     <w:link w:val="6"/>
@@ -2721,11 +2717,11 @@
       <w:rFonts w:eastAsia="" w:cs="" w:cstheme="majorBidi" w:eastAsiaTheme="majorEastAsia"/>
       <w:i/>
       <w:iCs/>
-      <w:color w:val="595959" w:themeColor="text1" w:themeTint="a6"/>
+      <w:color w:themeColor="text1" w:themeTint="a6" w:val="595959"/>
     </w:rPr>
   </w:style>
   <w:style w:type="paragraph" w:styleId="Heading7">
-    <w:name w:val="Heading 7"/>
+    <w:name w:val="heading 7"/>
     <w:basedOn w:val="Normal"/>
     <w:next w:val="Normal"/>
     <w:link w:val="7"/>
@@ -2742,11 +2738,11 @@
     </w:pPr>
     <w:rPr>
       <w:rFonts w:eastAsia="" w:cs="" w:cstheme="majorBidi" w:eastAsiaTheme="majorEastAsia"/>
-      <w:color w:val="595959" w:themeColor="text1" w:themeTint="a6"/>
+      <w:color w:themeColor="text1" w:themeTint="a6" w:val="595959"/>
     </w:rPr>
   </w:style>
   <w:style w:type="paragraph" w:styleId="Heading8">
-    <w:name w:val="Heading 8"/>
+    <w:name w:val="heading 8"/>
     <w:basedOn w:val="Normal"/>
     <w:next w:val="Normal"/>
     <w:link w:val="8"/>
@@ -2764,11 +2760,11 @@
       <w:rFonts w:eastAsia="" w:cs="" w:cstheme="majorBidi" w:eastAsiaTheme="majorEastAsia"/>
       <w:i/>
       <w:iCs/>
-      <w:color w:val="272727" w:themeColor="text1" w:themeTint="d8"/>
+      <w:color w:themeColor="text1" w:themeTint="d8" w:val="272727"/>
     </w:rPr>
   </w:style>
   <w:style w:type="paragraph" w:styleId="Heading9">
-    <w:name w:val="Heading 9"/>
+    <w:name w:val="heading 9"/>
     <w:basedOn w:val="Normal"/>
     <w:next w:val="Normal"/>
     <w:link w:val="9"/>
@@ -2784,7 +2780,7 @@
     </w:pPr>
     <w:rPr>
       <w:rFonts w:eastAsia="" w:cs="" w:cstheme="majorBidi" w:eastAsiaTheme="majorEastAsia"/>
-      <w:color w:val="272727" w:themeColor="text1" w:themeTint="d8"/>
+      <w:color w:themeColor="text1" w:themeTint="d8" w:val="272727"/>
     </w:rPr>
   </w:style>
   <w:style w:type="character" w:styleId="DefaultParagraphFont" w:default="1">
@@ -2798,13 +2794,12 @@
   <w:style w:type="character" w:styleId="1" w:customStyle="1">
     <w:name w:val="Заголовок 1 Знак"/>
     <w:basedOn w:val="DefaultParagraphFont"/>
-    <w:link w:val="Heading1"/>
     <w:uiPriority w:val="9"/>
     <w:qFormat/>
     <w:rsid w:val="00076c3b"/>
     <w:rPr>
       <w:rFonts w:ascii="Calibri Light" w:hAnsi="Calibri Light" w:eastAsia="" w:cs="" w:asciiTheme="majorHAnsi" w:cstheme="majorBidi" w:eastAsiaTheme="majorEastAsia" w:hAnsiTheme="majorHAnsi"/>
-      <w:color w:val="2F5496" w:themeColor="accent1" w:themeShade="bf"/>
+      <w:color w:themeColor="accent1" w:themeShade="bf" w:val="2F5496"/>
       <w:sz w:val="40"/>
       <w:szCs w:val="40"/>
     </w:rPr>
@@ -2812,14 +2807,13 @@
   <w:style w:type="character" w:styleId="2" w:customStyle="1">
     <w:name w:val="Заголовок 2 Знак"/>
     <w:basedOn w:val="DefaultParagraphFont"/>
-    <w:link w:val="Heading2"/>
     <w:uiPriority w:val="9"/>
     <w:semiHidden/>
     <w:qFormat/>
     <w:rsid w:val="00076c3b"/>
     <w:rPr>
       <w:rFonts w:ascii="Calibri Light" w:hAnsi="Calibri Light" w:eastAsia="" w:cs="" w:asciiTheme="majorHAnsi" w:cstheme="majorBidi" w:eastAsiaTheme="majorEastAsia" w:hAnsiTheme="majorHAnsi"/>
-      <w:color w:val="2F5496" w:themeColor="accent1" w:themeShade="bf"/>
+      <w:color w:themeColor="accent1" w:themeShade="bf" w:val="2F5496"/>
       <w:sz w:val="32"/>
       <w:szCs w:val="32"/>
     </w:rPr>
@@ -2827,14 +2821,13 @@
   <w:style w:type="character" w:styleId="3" w:customStyle="1">
     <w:name w:val="Заголовок 3 Знак"/>
     <w:basedOn w:val="DefaultParagraphFont"/>
-    <w:link w:val="Heading3"/>
     <w:uiPriority w:val="9"/>
     <w:semiHidden/>
     <w:qFormat/>
     <w:rsid w:val="00076c3b"/>
     <w:rPr>
       <w:rFonts w:eastAsia="" w:cs="" w:cstheme="majorBidi" w:eastAsiaTheme="majorEastAsia"/>
-      <w:color w:val="2F5496" w:themeColor="accent1" w:themeShade="bf"/>
+      <w:color w:themeColor="accent1" w:themeShade="bf" w:val="2F5496"/>
       <w:sz w:val="28"/>
       <w:szCs w:val="28"/>
     </w:rPr>
@@ -2842,7 +2835,6 @@
   <w:style w:type="character" w:styleId="4" w:customStyle="1">
     <w:name w:val="Заголовок 4 Знак"/>
     <w:basedOn w:val="DefaultParagraphFont"/>
-    <w:link w:val="Heading4"/>
     <w:uiPriority w:val="9"/>
     <w:semiHidden/>
     <w:qFormat/>
@@ -2851,26 +2843,24 @@
       <w:rFonts w:eastAsia="" w:cs="" w:cstheme="majorBidi" w:eastAsiaTheme="majorEastAsia"/>
       <w:i/>
       <w:iCs/>
-      <w:color w:val="2F5496" w:themeColor="accent1" w:themeShade="bf"/>
+      <w:color w:themeColor="accent1" w:themeShade="bf" w:val="2F5496"/>
     </w:rPr>
   </w:style>
   <w:style w:type="character" w:styleId="5" w:customStyle="1">
     <w:name w:val="Заголовок 5 Знак"/>
     <w:basedOn w:val="DefaultParagraphFont"/>
-    <w:link w:val="Heading5"/>
     <w:uiPriority w:val="9"/>
     <w:semiHidden/>
     <w:qFormat/>
     <w:rsid w:val="00076c3b"/>
     <w:rPr>
       <w:rFonts w:eastAsia="" w:cs="" w:cstheme="majorBidi" w:eastAsiaTheme="majorEastAsia"/>
-      <w:color w:val="2F5496" w:themeColor="accent1" w:themeShade="bf"/>
+      <w:color w:themeColor="accent1" w:themeShade="bf" w:val="2F5496"/>
     </w:rPr>
   </w:style>
   <w:style w:type="character" w:styleId="6" w:customStyle="1">
     <w:name w:val="Заголовок 6 Знак"/>
     <w:basedOn w:val="DefaultParagraphFont"/>
-    <w:link w:val="Heading6"/>
     <w:uiPriority w:val="9"/>
     <w:semiHidden/>
     <w:qFormat/>
@@ -2879,26 +2869,24 @@
       <w:rFonts w:eastAsia="" w:cs="" w:cstheme="majorBidi" w:eastAsiaTheme="majorEastAsia"/>
       <w:i/>
       <w:iCs/>
-      <w:color w:val="595959" w:themeColor="text1" w:themeTint="a6"/>
+      <w:color w:themeColor="text1" w:themeTint="a6" w:val="595959"/>
     </w:rPr>
   </w:style>
   <w:style w:type="character" w:styleId="7" w:customStyle="1">
     <w:name w:val="Заголовок 7 Знак"/>
     <w:basedOn w:val="DefaultParagraphFont"/>
-    <w:link w:val="Heading7"/>
     <w:uiPriority w:val="9"/>
     <w:semiHidden/>
     <w:qFormat/>
     <w:rsid w:val="00076c3b"/>
     <w:rPr>
       <w:rFonts w:eastAsia="" w:cs="" w:cstheme="majorBidi" w:eastAsiaTheme="majorEastAsia"/>
-      <w:color w:val="595959" w:themeColor="text1" w:themeTint="a6"/>
+      <w:color w:themeColor="text1" w:themeTint="a6" w:val="595959"/>
     </w:rPr>
   </w:style>
   <w:style w:type="character" w:styleId="8" w:customStyle="1">
     <w:name w:val="Заголовок 8 Знак"/>
     <w:basedOn w:val="DefaultParagraphFont"/>
-    <w:link w:val="Heading8"/>
     <w:uiPriority w:val="9"/>
     <w:semiHidden/>
     <w:qFormat/>
@@ -2907,26 +2895,24 @@
       <w:rFonts w:eastAsia="" w:cs="" w:cstheme="majorBidi" w:eastAsiaTheme="majorEastAsia"/>
       <w:i/>
       <w:iCs/>
-      <w:color w:val="272727" w:themeColor="text1" w:themeTint="d8"/>
+      <w:color w:themeColor="text1" w:themeTint="d8" w:val="272727"/>
     </w:rPr>
   </w:style>
   <w:style w:type="character" w:styleId="9" w:customStyle="1">
     <w:name w:val="Заголовок 9 Знак"/>
     <w:basedOn w:val="DefaultParagraphFont"/>
-    <w:link w:val="Heading9"/>
     <w:uiPriority w:val="9"/>
     <w:semiHidden/>
     <w:qFormat/>
     <w:rsid w:val="00076c3b"/>
     <w:rPr>
       <w:rFonts w:eastAsia="" w:cs="" w:cstheme="majorBidi" w:eastAsiaTheme="majorEastAsia"/>
-      <w:color w:val="272727" w:themeColor="text1" w:themeTint="d8"/>
+      <w:color w:themeColor="text1" w:themeTint="d8" w:val="272727"/>
     </w:rPr>
   </w:style>
   <w:style w:type="character" w:styleId="Style5" w:customStyle="1">
     <w:name w:val="Заголовок Знак"/>
     <w:basedOn w:val="DefaultParagraphFont"/>
-    <w:link w:val="Title"/>
     <w:uiPriority w:val="10"/>
     <w:qFormat/>
     <w:rsid w:val="00076c3b"/>
@@ -2941,13 +2927,12 @@
   <w:style w:type="character" w:styleId="Style6" w:customStyle="1">
     <w:name w:val="Подзаголовок Знак"/>
     <w:basedOn w:val="DefaultParagraphFont"/>
-    <w:link w:val="Subtitle"/>
     <w:uiPriority w:val="11"/>
     <w:qFormat/>
     <w:rsid w:val="00076c3b"/>
     <w:rPr>
       <w:rFonts w:eastAsia="" w:cs="" w:cstheme="majorBidi" w:eastAsiaTheme="majorEastAsia"/>
-      <w:color w:val="595959" w:themeColor="text1" w:themeTint="a6"/>
+      <w:color w:themeColor="text1" w:themeTint="a6" w:val="595959"/>
       <w:spacing w:val="15"/>
       <w:sz w:val="28"/>
       <w:szCs w:val="28"/>
@@ -2963,7 +2948,7 @@
     <w:rPr>
       <w:i/>
       <w:iCs/>
-      <w:color w:val="404040" w:themeColor="text1" w:themeTint="bf"/>
+      <w:color w:themeColor="text1" w:themeTint="bf" w:val="404040"/>
     </w:rPr>
   </w:style>
   <w:style w:type="character" w:styleId="IntenseEmphasis">
@@ -2975,7 +2960,7 @@
     <w:rPr>
       <w:i/>
       <w:iCs/>
-      <w:color w:val="2F5496" w:themeColor="accent1" w:themeShade="bf"/>
+      <w:color w:themeColor="accent1" w:themeShade="bf" w:val="2F5496"/>
     </w:rPr>
   </w:style>
   <w:style w:type="character" w:styleId="Style7" w:customStyle="1">
@@ -2988,7 +2973,7 @@
     <w:rPr>
       <w:i/>
       <w:iCs/>
-      <w:color w:val="2F5496" w:themeColor="accent1" w:themeShade="bf"/>
+      <w:color w:themeColor="accent1" w:themeShade="bf" w:val="2F5496"/>
     </w:rPr>
   </w:style>
   <w:style w:type="character" w:styleId="IntenseReference">
@@ -3001,14 +2986,14 @@
       <w:b/>
       <w:bCs/>
       <w:smallCaps/>
-      <w:color w:val="2F5496" w:themeColor="accent1" w:themeShade="bf"/>
+      <w:color w:themeColor="accent1" w:themeShade="bf" w:val="2F5496"/>
       <w:spacing w:val="5"/>
     </w:rPr>
   </w:style>
-  <w:style w:type="paragraph" w:styleId="Heading">
-    <w:name w:val="Heading"/>
+  <w:style w:type="paragraph" w:styleId="Style8">
+    <w:name w:val="Заголовок"/>
     <w:basedOn w:val="Normal"/>
-    <w:next w:val="TextBody"/>
+    <w:next w:val="BodyText"/>
     <w:qFormat/>
     <w:pPr>
       <w:keepNext w:val="true"/>
@@ -3020,7 +3005,7 @@
       <w:szCs w:val="28"/>
     </w:rPr>
   </w:style>
-  <w:style w:type="paragraph" w:styleId="TextBody">
+  <w:style w:type="paragraph" w:styleId="BodyText">
     <w:name w:val="Body Text"/>
     <w:basedOn w:val="Normal"/>
     <w:pPr>
@@ -3030,14 +3015,14 @@
   </w:style>
   <w:style w:type="paragraph" w:styleId="List">
     <w:name w:val="List"/>
-    <w:basedOn w:val="TextBody"/>
+    <w:basedOn w:val="BodyText"/>
     <w:pPr/>
     <w:rPr>
       <w:rFonts w:cs="Lohit Devanagari"/>
     </w:rPr>
   </w:style>
   <w:style w:type="paragraph" w:styleId="Caption">
-    <w:name w:val="Caption"/>
+    <w:name w:val="caption"/>
     <w:basedOn w:val="Normal"/>
     <w:qFormat/>
     <w:pPr>
@@ -3052,8 +3037,8 @@
       <w:szCs w:val="24"/>
     </w:rPr>
   </w:style>
-  <w:style w:type="paragraph" w:styleId="Index">
-    <w:name w:val="Index"/>
+  <w:style w:type="paragraph" w:styleId="Style9">
+    <w:name w:val="Указатель"/>
     <w:basedOn w:val="Normal"/>
     <w:qFormat/>
     <w:pPr>
@@ -3063,7 +3048,7 @@
       <w:rFonts w:cs="Lohit Devanagari"/>
     </w:rPr>
   </w:style>
-  <w:style w:type="paragraph" w:styleId="Style8" w:customStyle="1">
+  <w:style w:type="paragraph" w:styleId="Style10" w:customStyle="1">
     <w:name w:val="Отчет сиспрог"/>
     <w:basedOn w:val="NormalWeb"/>
     <w:qFormat/>
@@ -3128,7 +3113,7 @@
     </w:pPr>
     <w:rPr>
       <w:rFonts w:eastAsia="" w:cs="" w:cstheme="majorBidi" w:eastAsiaTheme="majorEastAsia"/>
-      <w:color w:val="595959" w:themeColor="text1" w:themeTint="a6"/>
+      <w:color w:themeColor="text1" w:themeTint="a6" w:val="595959"/>
       <w:spacing w:val="15"/>
       <w:sz w:val="28"/>
       <w:szCs w:val="28"/>
@@ -3149,7 +3134,7 @@
     <w:rPr>
       <w:i/>
       <w:iCs/>
-      <w:color w:val="404040" w:themeColor="text1" w:themeTint="bf"/>
+      <w:color w:themeColor="text1" w:themeTint="bf" w:val="404040"/>
     </w:rPr>
   </w:style>
   <w:style w:type="paragraph" w:styleId="ListParagraph">
@@ -3160,7 +3145,7 @@
     <w:rsid w:val="00076c3b"/>
     <w:pPr>
       <w:spacing w:before="0" w:after="0"/>
-      <w:ind w:left="720" w:hanging="0"/>
+      <w:ind w:hanging="0" w:start="720"/>
       <w:contextualSpacing/>
     </w:pPr>
     <w:rPr/>
@@ -3179,17 +3164,17 @@
         <w:bottom w:val="single" w:sz="4" w:space="10" w:color="2F5496"/>
       </w:pBdr>
       <w:spacing w:before="360" w:after="360"/>
-      <w:ind w:left="864" w:right="864" w:hanging="0"/>
+      <w:ind w:hanging="0" w:start="864" w:end="864"/>
       <w:jc w:val="center"/>
     </w:pPr>
     <w:rPr>
       <w:i/>
       <w:iCs/>
-      <w:color w:val="2F5496" w:themeColor="accent1" w:themeShade="bf"/>
-    </w:rPr>
-  </w:style>
-  <w:style w:type="numbering" w:styleId="NoList" w:default="1">
-    <w:name w:val="No List"/>
+      <w:color w:themeColor="accent1" w:themeShade="bf" w:val="2F5496"/>
+    </w:rPr>
+  </w:style>
+  <w:style w:type="numbering" w:styleId="Style11" w:default="1">
+    <w:name w:val="Без списка"/>
     <w:uiPriority w:val="99"/>
     <w:semiHidden/>
     <w:unhideWhenUsed/>
@@ -3213,195 +3198,97 @@
 </file>
 
 <file path=word/theme/theme1.xml><?xml version="1.0" encoding="utf-8"?>
-<a:theme xmlns:a="http://schemas.openxmlformats.org/drawingml/2006/main" name="Тема Office">
+<a:theme xmlns:a="http://schemas.openxmlformats.org/drawingml/2006/main" xmlns:r="http://schemas.openxmlformats.org/officeDocument/2006/relationships" name="Тема Office">
   <a:themeElements>
     <a:clrScheme name="Стандартная">
       <a:dk1>
-        <a:sysClr val="windowText" lastClr="000000"/>
+        <a:srgbClr val="000000"/>
       </a:dk1>
       <a:lt1>
-        <a:sysClr val="window" lastClr="FFFFFF"/>
+        <a:srgbClr val="ffffff"/>
       </a:lt1>
       <a:dk2>
-        <a:srgbClr val="44546A"/>
+        <a:srgbClr val="44546a"/>
       </a:dk2>
       <a:lt2>
-        <a:srgbClr val="E7E6E6"/>
+        <a:srgbClr val="e7e6e6"/>
       </a:lt2>
       <a:accent1>
-        <a:srgbClr val="4472C4"/>
+        <a:srgbClr val="4472c4"/>
       </a:accent1>
       <a:accent2>
-        <a:srgbClr val="ED7D31"/>
+        <a:srgbClr val="ed7d31"/>
       </a:accent2>
       <a:accent3>
-        <a:srgbClr val="A5A5A5"/>
+        <a:srgbClr val="a5a5a5"/>
       </a:accent3>
       <a:accent4>
-        <a:srgbClr val="FFC000"/>
+        <a:srgbClr val="ffc000"/>
       </a:accent4>
       <a:accent5>
-        <a:srgbClr val="5B9BD5"/>
+        <a:srgbClr val="5b9bd5"/>
       </a:accent5>
       <a:accent6>
-        <a:srgbClr val="70AD47"/>
+        <a:srgbClr val="70ad47"/>
       </a:accent6>
       <a:hlink>
-        <a:srgbClr val="0563C1"/>
+        <a:srgbClr val="0563c1"/>
       </a:hlink>
       <a:folHlink>
-        <a:srgbClr val="954F72"/>
+        <a:srgbClr val="954f72"/>
       </a:folHlink>
     </a:clrScheme>
     <a:fontScheme name="Стандартная">
       <a:majorFont>
-        <a:latin typeface="Calibri Light" panose="020F0302020204030204"/>
+        <a:latin typeface="Calibri Light" panose="020F0302020204030204" pitchFamily="0" charset="1"/>
         <a:ea typeface=""/>
         <a:cs typeface=""/>
-        <a:font script="Jpan" typeface="游ゴシック Light"/>
-        <a:font script="Hang" typeface="맑은 고딕"/>
-        <a:font script="Hans" typeface="等线 Light"/>
-        <a:font script="Hant" typeface="新細明體"/>
-        <a:font script="Arab" typeface="Times New Roman"/>
-        <a:font script="Hebr" typeface="Times New Roman"/>
-        <a:font script="Thai" typeface="Angsana New"/>
-        <a:font script="Ethi" typeface="Nyala"/>
-        <a:font script="Beng" typeface="Vrinda"/>
-        <a:font script="Gujr" typeface="Shruti"/>
-        <a:font script="Khmr" typeface="MoolBoran"/>
-        <a:font script="Knda" typeface="Tunga"/>
-        <a:font script="Guru" typeface="Raavi"/>
-        <a:font script="Cans" typeface="Euphemia"/>
-        <a:font script="Cher" typeface="Plantagenet Cherokee"/>
-        <a:font script="Yiii" typeface="Microsoft Yi Baiti"/>
-        <a:font script="Tibt" typeface="Microsoft Himalaya"/>
-        <a:font script="Thaa" typeface="MV Boli"/>
-        <a:font script="Deva" typeface="Mangal"/>
-        <a:font script="Telu" typeface="Gautami"/>
-        <a:font script="Taml" typeface="Latha"/>
-        <a:font script="Syrc" typeface="Estrangelo Edessa"/>
-        <a:font script="Orya" typeface="Kalinga"/>
-        <a:font script="Mlym" typeface="Kartika"/>
-        <a:font script="Laoo" typeface="DokChampa"/>
-        <a:font script="Sinh" typeface="Iskoola Pota"/>
-        <a:font script="Mong" typeface="Mongolian Baiti"/>
-        <a:font script="Viet" typeface="Times New Roman"/>
-        <a:font script="Uigh" typeface="Microsoft Uighur"/>
-        <a:font script="Geor" typeface="Sylfaen"/>
-        <a:font script="Armn" typeface="Arial"/>
-        <a:font script="Bugi" typeface="Leelawadee UI"/>
-        <a:font script="Bopo" typeface="Microsoft JhengHei"/>
-        <a:font script="Java" typeface="Javanese Text"/>
-        <a:font script="Lisu" typeface="Segoe UI"/>
-        <a:font script="Mymr" typeface="Myanmar Text"/>
-        <a:font script="Nkoo" typeface="Ebrima"/>
-        <a:font script="Olck" typeface="Nirmala UI"/>
-        <a:font script="Osma" typeface="Ebrima"/>
-        <a:font script="Phag" typeface="Phagspa"/>
-        <a:font script="Syrn" typeface="Estrangelo Edessa"/>
-        <a:font script="Syrj" typeface="Estrangelo Edessa"/>
-        <a:font script="Syre" typeface="Estrangelo Edessa"/>
-        <a:font script="Sora" typeface="Nirmala UI"/>
-        <a:font script="Tale" typeface="Microsoft Tai Le"/>
-        <a:font script="Talu" typeface="Microsoft New Tai Lue"/>
-        <a:font script="Tfng" typeface="Ebrima"/>
       </a:majorFont>
       <a:minorFont>
-        <a:latin typeface="Calibri" panose="020F0502020204030204"/>
+        <a:latin typeface="Calibri" panose="020F0502020204030204" pitchFamily="0" charset="1"/>
         <a:ea typeface=""/>
         <a:cs typeface=""/>
-        <a:font script="Jpan" typeface="游ゴシック"/>
-        <a:font script="Hang" typeface="맑은 고딕"/>
-        <a:font script="Hans" typeface="等线"/>
-        <a:font script="Hant" typeface="新細明體"/>
-        <a:font script="Arab" typeface="Arial"/>
-        <a:font script="Hebr" typeface="Arial"/>
-        <a:font script="Thai" typeface="Cordia New"/>
-        <a:font script="Ethi" typeface="Nyala"/>
-        <a:font script="Beng" typeface="Vrinda"/>
-        <a:font script="Gujr" typeface="Shruti"/>
-        <a:font script="Khmr" typeface="DaunPenh"/>
-        <a:font script="Knda" typeface="Tunga"/>
-        <a:font script="Guru" typeface="Raavi"/>
-        <a:font script="Cans" typeface="Euphemia"/>
-        <a:font script="Cher" typeface="Plantagenet Cherokee"/>
-        <a:font script="Yiii" typeface="Microsoft Yi Baiti"/>
-        <a:font script="Tibt" typeface="Microsoft Himalaya"/>
-        <a:font script="Thaa" typeface="MV Boli"/>
-        <a:font script="Deva" typeface="Mangal"/>
-        <a:font script="Telu" typeface="Gautami"/>
-        <a:font script="Taml" typeface="Latha"/>
-        <a:font script="Syrc" typeface="Estrangelo Edessa"/>
-        <a:font script="Orya" typeface="Kalinga"/>
-        <a:font script="Mlym" typeface="Kartika"/>
-        <a:font script="Laoo" typeface="DokChampa"/>
-        <a:font script="Sinh" typeface="Iskoola Pota"/>
-        <a:font script="Mong" typeface="Mongolian Baiti"/>
-        <a:font script="Viet" typeface="Arial"/>
-        <a:font script="Uigh" typeface="Microsoft Uighur"/>
-        <a:font script="Geor" typeface="Sylfaen"/>
-        <a:font script="Armn" typeface="Arial"/>
-        <a:font script="Bugi" typeface="Leelawadee UI"/>
-        <a:font script="Bopo" typeface="Microsoft JhengHei"/>
-        <a:font script="Java" typeface="Javanese Text"/>
-        <a:font script="Lisu" typeface="Segoe UI"/>
-        <a:font script="Mymr" typeface="Myanmar Text"/>
-        <a:font script="Nkoo" typeface="Ebrima"/>
-        <a:font script="Olck" typeface="Nirmala UI"/>
-        <a:font script="Osma" typeface="Ebrima"/>
-        <a:font script="Phag" typeface="Phagspa"/>
-        <a:font script="Syrn" typeface="Estrangelo Edessa"/>
-        <a:font script="Syrj" typeface="Estrangelo Edessa"/>
-        <a:font script="Syre" typeface="Estrangelo Edessa"/>
-        <a:font script="Sora" typeface="Nirmala UI"/>
-        <a:font script="Tale" typeface="Microsoft Tai Le"/>
-        <a:font script="Talu" typeface="Microsoft New Tai Lue"/>
-        <a:font script="Tfng" typeface="Ebrima"/>
       </a:minorFont>
     </a:fontScheme>
-    <a:fmtScheme name="Стандартная">
+    <a:fmtScheme>
       <a:fillStyleLst>
         <a:solidFill>
           <a:schemeClr val="phClr"/>
         </a:solidFill>
-        <a:gradFill rotWithShape="1">
+        <a:gradFill>
           <a:gsLst>
             <a:gs pos="0">
               <a:schemeClr val="phClr">
                 <a:lumMod val="110000"/>
-                <a:satMod val="105000"/>
                 <a:tint val="67000"/>
               </a:schemeClr>
             </a:gs>
             <a:gs pos="50000">
               <a:schemeClr val="phClr">
                 <a:lumMod val="105000"/>
-                <a:satMod val="103000"/>
                 <a:tint val="73000"/>
               </a:schemeClr>
             </a:gs>
             <a:gs pos="100000">
               <a:schemeClr val="phClr">
                 <a:lumMod val="105000"/>
-                <a:satMod val="109000"/>
                 <a:tint val="81000"/>
               </a:schemeClr>
             </a:gs>
           </a:gsLst>
           <a:lin ang="5400000" scaled="0"/>
+          <a:tileRect l="0" t="0" r="0" b="0"/>
         </a:gradFill>
-        <a:gradFill rotWithShape="1">
+        <a:gradFill>
           <a:gsLst>
             <a:gs pos="0">
               <a:schemeClr val="phClr">
-                <a:satMod val="103000"/>
                 <a:lumMod val="102000"/>
                 <a:tint val="94000"/>
               </a:schemeClr>
             </a:gs>
             <a:gs pos="50000">
               <a:schemeClr val="phClr">
-                <a:satMod val="110000"/>
                 <a:lumMod val="100000"/>
                 <a:shade val="100000"/>
               </a:schemeClr>
@@ -3409,33 +3296,24 @@
             <a:gs pos="100000">
               <a:schemeClr val="phClr">
                 <a:lumMod val="99000"/>
-                <a:satMod val="120000"/>
                 <a:shade val="78000"/>
               </a:schemeClr>
             </a:gs>
           </a:gsLst>
           <a:lin ang="5400000" scaled="0"/>
+          <a:tileRect l="0" t="0" r="0" b="0"/>
         </a:gradFill>
       </a:fillStyleLst>
       <a:lnStyleLst>
         <a:ln w="6350" cap="flat" cmpd="sng" algn="ctr">
-          <a:solidFill>
-            <a:schemeClr val="phClr"/>
-          </a:solidFill>
           <a:prstDash val="solid"/>
           <a:miter lim="800000"/>
         </a:ln>
         <a:ln w="12700" cap="flat" cmpd="sng" algn="ctr">
-          <a:solidFill>
-            <a:schemeClr val="phClr"/>
-          </a:solidFill>
           <a:prstDash val="solid"/>
           <a:miter lim="800000"/>
         </a:ln>
         <a:ln w="19050" cap="flat" cmpd="sng" algn="ctr">
-          <a:solidFill>
-            <a:schemeClr val="phClr"/>
-          </a:solidFill>
           <a:prstDash val="solid"/>
           <a:miter lim="800000"/>
         </a:ln>
@@ -3448,13 +3326,7 @@
           <a:effectLst/>
         </a:effectStyle>
         <a:effectStyle>
-          <a:effectLst>
-            <a:outerShdw blurRad="57150" dist="19050" dir="5400000" algn="ctr" rotWithShape="0">
-              <a:srgbClr val="000000">
-                <a:alpha val="63000"/>
-              </a:srgbClr>
-            </a:outerShdw>
-          </a:effectLst>
+          <a:effectLst/>
         </a:effectStyle>
       </a:effectStyleLst>
       <a:bgFillStyleLst>
@@ -3464,15 +3336,13 @@
         <a:solidFill>
           <a:schemeClr val="phClr">
             <a:tint val="95000"/>
-            <a:satMod val="170000"/>
           </a:schemeClr>
         </a:solidFill>
-        <a:gradFill rotWithShape="1">
+        <a:gradFill>
           <a:gsLst>
             <a:gs pos="0">
               <a:schemeClr val="phClr">
                 <a:tint val="93000"/>
-                <a:satMod val="150000"/>
                 <a:shade val="98000"/>
                 <a:lumMod val="102000"/>
               </a:schemeClr>
@@ -3480,7 +3350,6 @@
             <a:gs pos="50000">
               <a:schemeClr val="phClr">
                 <a:tint val="98000"/>
-                <a:satMod val="130000"/>
                 <a:shade val="90000"/>
                 <a:lumMod val="103000"/>
               </a:schemeClr>
@@ -3488,21 +3357,14 @@
             <a:gs pos="100000">
               <a:schemeClr val="phClr">
                 <a:shade val="63000"/>
-                <a:satMod val="120000"/>
               </a:schemeClr>
             </a:gs>
           </a:gsLst>
           <a:lin ang="5400000" scaled="0"/>
+          <a:tileRect l="0" t="0" r="0" b="0"/>
         </a:gradFill>
       </a:bgFillStyleLst>
     </a:fmtScheme>
   </a:themeElements>
-  <a:objectDefaults/>
-  <a:extraClrSchemeLst/>
-  <a:extLst>
-    <a:ext uri="{05A4C25C-085E-4340-85A3-A5531E510DB2}">
-      <thm15:themeFamily xmlns:thm15="http://schemas.microsoft.com/office/thememl/2012/main" name="Office Theme" id="{62F939B6-93AF-4DB8-9C6B-D6C7DFDC589F}" vid="{4A3C46E8-61CC-4603-A589-7422A47A8E4A}"/>
-    </a:ext>
-  </a:extLst>
 </a:theme>
 </file>
</xml_diff>